<commit_message>
feat: complete ESA report template with chapter numbers and page breaks
Major updates:
- Add chapter numbering (1-10) to report_merge node in Dify workflow
- Add page breaks before each chapter (Heading 2)
- Update footer with filename, confidential statement, page numbers, and logo
- Fix Dockerfile to prevent auto-generated template overwrite
- Update reference.docx template with BDAE brand colors
- Remove horizontal lines (---) between chapters
- Container health check passing

Files:
- templates/reference.docx (64K)
- templates/logo.png (20K)
- app.py (with add_page_breaks function)
- Dockerfile (CMD fixed)
- ESA_v4_final.yml Dify workflow (report_merge node updated)

Tested: 2026-03-02
Status: ✅ All working

Co-authored-by: 9哥 (Product Owner)
Co-authored-by: Mac (AI Assistant)
</commit_message>
<xml_diff>
--- a/templates/reference.docx
+++ b/templates/reference.docx
@@ -59,7 +59,12 @@
     </w:p>
     <w:p>
       <w:r>
-        <w:t>四级标题采用黑色字体，与普通正文保持一致，但通过加粗和字号区分层级。这种设计确保文档层次清晰，便于阅读。</w:t>
+        <w:t>四级标题采用黑色字体，与普通正文保持一致，但通过加粗和字号区分层级。这种设计确保文档层次清晰，便于</w:t>
+      </w:r>
+      <w:bookmarkStart w:id="0" w:name="_GoBack"/>
+      <w:bookmarkEnd w:id="0"/>
+      <w:r>
+        <w:t>阅读。</w:t>
       </w:r>
     </w:p>
     <w:p>
@@ -456,8 +461,6 @@
       <w:r>
         <w:t>附件：样式速查表</w:t>
       </w:r>
-      <w:bookmarkStart w:id="0" w:name="_GoBack"/>
-      <w:bookmarkEnd w:id="0"/>
     </w:p>
     <w:p>
       <w:r>
@@ -628,19 +631,108 @@
   <w:p>
     <w:pPr>
       <w:pStyle w:val="24"/>
+      <w:keepNext w:val="0"/>
+      <w:keepLines w:val="0"/>
+      <w:pageBreakBefore w:val="0"/>
+      <w:widowControl/>
       <w:tabs>
         <w:tab w:val="right" w:pos="9020"/>
         <w:tab w:val="clear" w:pos="9360"/>
       </w:tabs>
+      <w:kinsoku/>
+      <w:wordWrap/>
+      <w:overflowPunct/>
+      <w:topLinePunct w:val="0"/>
+      <w:bidi w:val="0"/>
+      <w:adjustRightInd/>
+      <w:snapToGrid/>
+      <w:spacing w:line="120" w:lineRule="auto"/>
       <w:jc w:val="left"/>
-    </w:pPr>
-    <w:r>
+      <w:textAlignment w:val="auto"/>
       <w:rPr>
         <w:rFonts w:ascii="Arial" w:hAnsi="Arial"/>
         <w:color w:val="808080"/>
         <w:sz w:val="16"/>
       </w:rPr>
-      <w:t>{filename} | PRIVILEGED AND CONFIDENTIAL</w:t>
+    </w:pPr>
+    <w:r>
+      <w:rPr>
+        <w:rFonts w:hint="default" w:ascii="Arial" w:hAnsi="Arial"/>
+        <w:color w:val="808080"/>
+        <w:sz w:val="16"/>
+      </w:rPr>
+      <w:fldChar w:fldCharType="begin"/>
+    </w:r>
+    <w:r>
+      <w:rPr>
+        <w:rFonts w:hint="default" w:ascii="Arial" w:hAnsi="Arial"/>
+        <w:color w:val="808080"/>
+        <w:sz w:val="16"/>
+      </w:rPr>
+      <w:instrText xml:space="preserve"> FILENAME \* MERGEFORMAT </w:instrText>
+    </w:r>
+    <w:r>
+      <w:rPr>
+        <w:rFonts w:hint="default" w:ascii="Arial" w:hAnsi="Arial"/>
+        <w:color w:val="808080"/>
+        <w:sz w:val="16"/>
+      </w:rPr>
+      <w:fldChar w:fldCharType="separate"/>
+    </w:r>
+    <w:r>
+      <w:rPr>
+        <w:rFonts w:hint="default" w:ascii="Arial" w:hAnsi="Arial"/>
+        <w:color w:val="808080"/>
+        <w:sz w:val="16"/>
+      </w:rPr>
+      <w:t>reference.docx</w:t>
+    </w:r>
+    <w:r>
+      <w:rPr>
+        <w:rFonts w:hint="default" w:ascii="Arial" w:hAnsi="Arial"/>
+        <w:color w:val="808080"/>
+        <w:sz w:val="16"/>
+      </w:rPr>
+      <w:fldChar w:fldCharType="end"/>
+    </w:r>
+    <w:r>
+      <w:rPr>
+        <w:rFonts w:ascii="Arial" w:hAnsi="Arial"/>
+        <w:color w:val="808080"/>
+        <w:sz w:val="16"/>
+      </w:rPr>
+      <w:t xml:space="preserve"> </w:t>
+    </w:r>
+  </w:p>
+  <w:p>
+    <w:pPr>
+      <w:pStyle w:val="24"/>
+      <w:keepNext w:val="0"/>
+      <w:keepLines w:val="0"/>
+      <w:pageBreakBefore w:val="0"/>
+      <w:widowControl/>
+      <w:tabs>
+        <w:tab w:val="right" w:pos="9020"/>
+        <w:tab w:val="clear" w:pos="9360"/>
+      </w:tabs>
+      <w:kinsoku/>
+      <w:wordWrap/>
+      <w:overflowPunct/>
+      <w:topLinePunct w:val="0"/>
+      <w:bidi w:val="0"/>
+      <w:adjustRightInd/>
+      <w:snapToGrid/>
+      <w:spacing w:line="120" w:lineRule="auto"/>
+      <w:jc w:val="left"/>
+      <w:textAlignment w:val="auto"/>
+    </w:pPr>
+    <w:r>
+      <w:rPr>
+        <w:rFonts w:ascii="Arial" w:hAnsi="Arial"/>
+        <w:color w:val="808080"/>
+        <w:sz w:val="16"/>
+      </w:rPr>
+      <w:t>PRIVILEGED AND CONFIDENTIAL</w:t>
     </w:r>
     <w:r>
       <w:rPr>

</xml_diff>